<commit_message>
docs(docmgmt): PRD + Executive Summary v1.4 — Phase 3 implemented; decided contracts recorded
- PRD v1.4: revision row + DOC-07 failure contract (move first, flip after,
  move-back rollback), DOC-08 retry decided (self-healing best-effort, no
  durable queue), §9 Phase 3 marked implemented (live demo pending
  activation).
- Executive Summary v1.4: lockstep revision row (no contract change);
  the stale prds/ v1.0 copy is now synced to v1.4 (closes the CLAUDE.md
  pending item).
- Phase 3 kickoff prompt marked EXECUTED with the session's rulings +
  remaining activation pointer; README Documents description updated
  (placeholder -> the real tab); CLAUDE.md stale-copy note resolved.

Co-Authored-By: Claude Fable 5 <noreply@anthropic.com>
</commit_message>
<xml_diff>
--- a/prds/CBM-DocMgmt-Executive-Summary.docx
+++ b/prds/CBM-DocMgmt-Executive-Summary.docx
@@ -62,7 +62,7 @@
           <w:sz w:val="22"/>
           <w:szCs w:val="22"/>
         </w:rPr>
-        <w:t xml:space="preserve">Version: 1.0</w:t>
+        <w:t>Version: 1.4</w:t>
       </w:r>
     </w:p>
     <w:p>
@@ -76,7 +76,7 @@
           <w:sz w:val="22"/>
           <w:szCs w:val="22"/>
         </w:rPr>
-        <w:t xml:space="preserve">Last Updated: 07-16-26 12:19</w:t>
+        <w:t>Last Updated: 07-17-26 01:25</w:t>
       </w:r>
     </w:p>
     <w:p>
@@ -90,7 +90,7 @@
           <w:sz w:val="22"/>
           <w:szCs w:val="22"/>
         </w:rPr>
-        <w:t xml:space="preserve">Companion to: Document Management (DOC-MGMT) — Implementation PRD, v1.0</w:t>
+        <w:t>Companion to: Document Management (DOC-MGMT) — Implementation PRD, v1.4</w:t>
       </w:r>
     </w:p>
     <w:p>
@@ -254,6 +254,350 @@
             </w:tcMar>
           </w:tcPr>
           <w:p>
+            <w:r>
+              <w:t xml:space="preserve">1.4</w:t>
+            </w:r>
+          </w:p>
+        </w:tc>
+        <w:tc>
+          <w:tcPr>
+            <w:tcW w:type="dxa" w:w="1500"/>
+            <w:tcMar>
+              <w:top w:type="dxa" w:w="60"/>
+              <w:left w:type="dxa" w:w="100"/>
+              <w:bottom w:type="dxa" w:w="60"/>
+              <w:right w:type="dxa" w:w="100"/>
+            </w:tcMar>
+          </w:tcPr>
+          <w:p>
+            <w:r>
+              <w:t xml:space="preserve">07-17-26 01:25</w:t>
+            </w:r>
+          </w:p>
+        </w:tc>
+        <w:tc>
+          <w:tcPr>
+            <w:tcW w:type="dxa" w:w="2300"/>
+            <w:tcMar>
+              <w:top w:type="dxa" w:w="60"/>
+              <w:left w:type="dxa" w:w="100"/>
+              <w:bottom w:type="dxa" w:w="60"/>
+              <w:right w:type="dxa" w:w="100"/>
+            </w:tcMar>
+          </w:tcPr>
+          <w:p>
+            <w:r>
+              <w:t xml:space="preserve">Doug Bower (drafted with Claude)</w:t>
+            </w:r>
+          </w:p>
+        </w:tc>
+        <w:tc>
+          <w:tcPr>
+            <w:tcW w:type="dxa" w:w="4460"/>
+            <w:tcMar>
+              <w:top w:type="dxa" w:w="60"/>
+              <w:left w:type="dxa" w:w="100"/>
+              <w:bottom w:type="dxa" w:w="60"/>
+              <w:right w:type="dxa" w:w="100"/>
+            </w:tcMar>
+          </w:tcPr>
+          <w:p>
+            <w:r>
+              <w:t xml:space="preserve">Phase 3 implemented in the application (v0.76.0): the folder-grant machinery, nightly reconciliation, archive/restore, and CRM folder links described here now exist in code. No change to the access model or to any commitment in this document; the PRD v1.4 records the implementation decisions. Live activation (drive membership swap plus configuration) is the remaining step.</w:t>
+            </w:r>
+          </w:p>
+        </w:tc>
+      </w:tr>
+      <w:tr>
+        <w:tc>
+          <w:tcPr>
+            <w:tcW w:type="dxa" w:w="1100"/>
+            <w:tcMar>
+              <w:top w:type="dxa" w:w="60"/>
+              <w:left w:type="dxa" w:w="100"/>
+              <w:bottom w:type="dxa" w:w="60"/>
+              <w:right w:type="dxa" w:w="100"/>
+            </w:tcMar>
+          </w:tcPr>
+          <w:p>
+            <w:r>
+              <w:t>1.3</w:t>
+            </w:r>
+          </w:p>
+        </w:tc>
+        <w:tc>
+          <w:tcPr>
+            <w:tcW w:type="dxa" w:w="1500"/>
+            <w:tcMar>
+              <w:top w:type="dxa" w:w="60"/>
+              <w:left w:type="dxa" w:w="100"/>
+              <w:bottom w:type="dxa" w:w="60"/>
+              <w:right w:type="dxa" w:w="100"/>
+            </w:tcMar>
+          </w:tcPr>
+          <w:p>
+            <w:r>
+              <w:t>07-16-26 23:58</w:t>
+            </w:r>
+          </w:p>
+        </w:tc>
+        <w:tc>
+          <w:tcPr>
+            <w:tcW w:type="dxa" w:w="2300"/>
+            <w:tcMar>
+              <w:top w:type="dxa" w:w="60"/>
+              <w:left w:type="dxa" w:w="100"/>
+              <w:bottom w:type="dxa" w:w="60"/>
+              <w:right w:type="dxa" w:w="100"/>
+            </w:tcMar>
+          </w:tcPr>
+          <w:p>
+            <w:r>
+              <w:t>Doug Bower (drafted with Claude)</w:t>
+            </w:r>
+          </w:p>
+        </w:tc>
+        <w:tc>
+          <w:tcPr>
+            <w:tcW w:type="dxa" w:w="4460"/>
+            <w:tcMar>
+              <w:top w:type="dxa" w:w="60"/>
+              <w:left w:type="dxa" w:w="100"/>
+              <w:bottom w:type="dxa" w:w="60"/>
+              <w:right w:type="dxa" w:w="100"/>
+            </w:tcMar>
+          </w:tcPr>
+          <w:p>
+            <w:r>
+              <w:t>Access model finalized. No person is a member of the shared drive (the application's service identity is the sole member); the application performs all document operations and is the sole gate, enforcing the CRM's permissions; Drive-side access is per-person, folder-level Commenter grants that mirror CRM assignments, with automatic revocation and a nightly reconciliation; mentor personnel folders carry no grants (app-only). Section 1.2 rewritten as the precise access model with anticipated questions (1.3); walkthrough, strengths, and trade-offs updated to match, including the as-built web viewer (browser-held copies, Download original).</w:t>
+            </w:r>
+          </w:p>
+        </w:tc>
+      </w:tr>
+      <w:tr>
+        <w:tc>
+          <w:tcPr>
+            <w:tcW w:type="dxa" w:w="1100"/>
+            <w:tcMar>
+              <w:top w:type="dxa" w:w="60"/>
+              <w:left w:type="dxa" w:w="100"/>
+              <w:bottom w:type="dxa" w:w="60"/>
+              <w:right w:type="dxa" w:w="100"/>
+            </w:tcMar>
+          </w:tcPr>
+          <w:p>
+            <w:pPr>
+              <w:spacing w:after="0"/>
+            </w:pPr>
+            <w:r>
+              <w:rPr>
+                <w:rFonts w:ascii="Calibri" w:cs="Calibri" w:eastAsia="Calibri" w:hAnsi="Calibri"/>
+                <w:b w:val="false"/>
+                <w:bCs w:val="false"/>
+                <w:sz w:val="20"/>
+                <w:szCs w:val="20"/>
+              </w:rPr>
+              <w:t xml:space="preserve">1.2</w:t>
+            </w:r>
+          </w:p>
+        </w:tc>
+        <w:tc>
+          <w:tcPr>
+            <w:tcW w:type="dxa" w:w="1500"/>
+            <w:tcMar>
+              <w:top w:type="dxa" w:w="60"/>
+              <w:left w:type="dxa" w:w="100"/>
+              <w:bottom w:type="dxa" w:w="60"/>
+              <w:right w:type="dxa" w:w="100"/>
+            </w:tcMar>
+          </w:tcPr>
+          <w:p>
+            <w:pPr>
+              <w:spacing w:after="0"/>
+            </w:pPr>
+            <w:r>
+              <w:rPr>
+                <w:rFonts w:ascii="Calibri" w:cs="Calibri" w:eastAsia="Calibri" w:hAnsi="Calibri"/>
+                <w:b w:val="false"/>
+                <w:bCs w:val="false"/>
+                <w:sz w:val="20"/>
+                <w:szCs w:val="20"/>
+              </w:rPr>
+              <w:t xml:space="preserve">07-16-26 14:33</w:t>
+            </w:r>
+          </w:p>
+        </w:tc>
+        <w:tc>
+          <w:tcPr>
+            <w:tcW w:type="dxa" w:w="2300"/>
+            <w:tcMar>
+              <w:top w:type="dxa" w:w="60"/>
+              <w:left w:type="dxa" w:w="100"/>
+              <w:bottom w:type="dxa" w:w="60"/>
+              <w:right w:type="dxa" w:w="100"/>
+            </w:tcMar>
+          </w:tcPr>
+          <w:p>
+            <w:pPr>
+              <w:spacing w:after="0"/>
+            </w:pPr>
+            <w:r>
+              <w:rPr>
+                <w:rFonts w:ascii="Calibri" w:cs="Calibri" w:eastAsia="Calibri" w:hAnsi="Calibri"/>
+                <w:b w:val="false"/>
+                <w:bCs w:val="false"/>
+                <w:sz w:val="20"/>
+                <w:szCs w:val="20"/>
+              </w:rPr>
+              <w:t xml:space="preserve">Doug Bower (drafted with Claude)</w:t>
+            </w:r>
+          </w:p>
+        </w:tc>
+        <w:tc>
+          <w:tcPr>
+            <w:tcW w:type="dxa" w:w="4460"/>
+            <w:tcMar>
+              <w:top w:type="dxa" w:w="60"/>
+              <w:left w:type="dxa" w:w="100"/>
+              <w:bottom w:type="dxa" w:w="60"/>
+              <w:right w:type="dxa" w:w="100"/>
+            </w:tcMar>
+          </w:tcPr>
+          <w:p>
+            <w:pPr>
+              <w:spacing w:after="0"/>
+            </w:pPr>
+            <w:r>
+              <w:rPr>
+                <w:rFonts w:ascii="Calibri" w:cs="Calibri" w:eastAsia="Calibri" w:hAnsi="Calibri"/>
+                <w:b w:val="false"/>
+                <w:bCs w:val="false"/>
+                <w:sz w:val="20"/>
+                <w:szCs w:val="20"/>
+              </w:rPr>
+              <w:t xml:space="preserve">Folder-tree illustration added to Section 4; top-level Drive folders shown with their display labels (Mentors, Clients); engagement folders named by the engagement record's Name field.</w:t>
+            </w:r>
+          </w:p>
+        </w:tc>
+      </w:tr>
+      <w:tr>
+        <w:tc>
+          <w:tcPr>
+            <w:tcW w:type="dxa" w:w="1100"/>
+            <w:tcMar>
+              <w:top w:type="dxa" w:w="60"/>
+              <w:left w:type="dxa" w:w="100"/>
+              <w:bottom w:type="dxa" w:w="60"/>
+              <w:right w:type="dxa" w:w="100"/>
+            </w:tcMar>
+          </w:tcPr>
+          <w:p>
+            <w:pPr>
+              <w:spacing w:after="0"/>
+            </w:pPr>
+            <w:r>
+              <w:rPr>
+                <w:rFonts w:ascii="Calibri" w:cs="Calibri" w:eastAsia="Calibri" w:hAnsi="Calibri"/>
+                <w:b w:val="false"/>
+                <w:bCs w:val="false"/>
+                <w:sz w:val="20"/>
+                <w:szCs w:val="20"/>
+              </w:rPr>
+              <w:t xml:space="preserve">1.1</w:t>
+            </w:r>
+          </w:p>
+        </w:tc>
+        <w:tc>
+          <w:tcPr>
+            <w:tcW w:type="dxa" w:w="1500"/>
+            <w:tcMar>
+              <w:top w:type="dxa" w:w="60"/>
+              <w:left w:type="dxa" w:w="100"/>
+              <w:bottom w:type="dxa" w:w="60"/>
+              <w:right w:type="dxa" w:w="100"/>
+            </w:tcMar>
+          </w:tcPr>
+          <w:p>
+            <w:pPr>
+              <w:spacing w:after="0"/>
+            </w:pPr>
+            <w:r>
+              <w:rPr>
+                <w:rFonts w:ascii="Calibri" w:cs="Calibri" w:eastAsia="Calibri" w:hAnsi="Calibri"/>
+                <w:b w:val="false"/>
+                <w:bCs w:val="false"/>
+                <w:sz w:val="20"/>
+                <w:szCs w:val="20"/>
+              </w:rPr>
+              <w:t xml:space="preserve">07-16-26 13:42</w:t>
+            </w:r>
+          </w:p>
+        </w:tc>
+        <w:tc>
+          <w:tcPr>
+            <w:tcW w:type="dxa" w:w="2300"/>
+            <w:tcMar>
+              <w:top w:type="dxa" w:w="60"/>
+              <w:left w:type="dxa" w:w="100"/>
+              <w:bottom w:type="dxa" w:w="60"/>
+              <w:right w:type="dxa" w:w="100"/>
+            </w:tcMar>
+          </w:tcPr>
+          <w:p>
+            <w:pPr>
+              <w:spacing w:after="0"/>
+            </w:pPr>
+            <w:r>
+              <w:rPr>
+                <w:rFonts w:ascii="Calibri" w:cs="Calibri" w:eastAsia="Calibri" w:hAnsi="Calibri"/>
+                <w:b w:val="false"/>
+                <w:bCs w:val="false"/>
+                <w:sz w:val="20"/>
+                <w:szCs w:val="20"/>
+              </w:rPr>
+              <w:t xml:space="preserve">Doug Bower (drafted with Claude)</w:t>
+            </w:r>
+          </w:p>
+        </w:tc>
+        <w:tc>
+          <w:tcPr>
+            <w:tcW w:type="dxa" w:w="4460"/>
+            <w:tcMar>
+              <w:top w:type="dxa" w:w="60"/>
+              <w:left w:type="dxa" w:w="100"/>
+              <w:bottom w:type="dxa" w:w="60"/>
+              <w:right w:type="dxa" w:w="100"/>
+            </w:tcMar>
+          </w:tcPr>
+          <w:p>
+            <w:pPr>
+              <w:spacing w:after="0"/>
+            </w:pPr>
+            <w:r>
+              <w:rPr>
+                <w:rFonts w:ascii="Calibri" w:cs="Calibri" w:eastAsia="Calibri" w:hAnsi="Calibri"/>
+                <w:b w:val="false"/>
+                <w:bCs w:val="false"/>
+                <w:sz w:val="20"/>
+                <w:szCs w:val="20"/>
+              </w:rPr>
+              <w:t xml:space="preserve">Engagement anchoring. Client-work documents now belong to the engagement a mentor is assigned to: walkthrough revised with an engagement upload example, folder organization updated (engagement subfolders under each client), and the folder-question section extended to cover client and engagement folders.</w:t>
+            </w:r>
+          </w:p>
+        </w:tc>
+      </w:tr>
+      <w:tr>
+        <w:tc>
+          <w:tcPr>
+            <w:tcW w:type="dxa" w:w="1100"/>
+            <w:tcMar>
+              <w:top w:type="dxa" w:w="60"/>
+              <w:left w:type="dxa" w:w="100"/>
+              <w:bottom w:type="dxa" w:w="60"/>
+              <w:right w:type="dxa" w:w="100"/>
+            </w:tcMar>
+          </w:tcPr>
+          <w:p>
             <w:pPr>
               <w:spacing w:after="0"/>
             </w:pPr>
@@ -390,7 +734,7 @@
           <w:sz w:val="22"/>
           <w:szCs w:val="22"/>
         </w:rPr>
-        <w:t xml:space="preserve">All documents live in a single CBM shared Google Drive, organized so that every mentor (and eventually every client) has their own clearly named folder. The application keeps a small index — its own record of which document belongs to which person, what kind of document it is, who uploaded it, and when. Google Drive holds the files; the application's index holds the facts about them.</w:t>
+        <w:t xml:space="preserve">All documents live in a single CBM shared Google Drive. Every document belongs to exactly one record: documents about a mentor (a resume, a signed mentor agreement) belong to that mentor and live in the mentor's folder; documents produced during client work (pitch decks, meeting notes, intake materials) belong to the specific engagement — the assignment pairing a mentor with a client — and live in that engagement's folder, which sits inside the client's folder. The application keeps a small index — its own record of which document belongs to which record, what kind of document it is, who uploaded it, and when. Google Drive holds the files; the application's index holds the facts about them.</w:t>
       </w:r>
     </w:p>
     <w:p>
@@ -425,7 +769,7 @@
           <w:sz w:val="22"/>
           <w:szCs w:val="22"/>
         </w:rPr>
-        <w:t xml:space="preserve">Upload. A coordinator reviewing a mentor applicant clicks Upload in the application, picks the resume, and tags it "Resume." The application places the file in that mentor's Drive folder — creating the folder automatically if it is the mentor's first document — and records the details in its index. The file is stored exactly as uploaded: a Word file stays a Word file, an Excel file stays an Excel file.</w:t>
+        <w:t xml:space="preserve">Upload during an engagement. Mentor X, working with client Z, opens their engagement in the application, clicks Upload, picks Z's revised pitch deck, and tags it "Pitch Deck." The application places the file in that engagement's Drive folder — inside client Z's folder, created automatically on first upload — and records the details in its index. The file is stored exactly as uploaded: a Word file stays a Word file, an Excel file stays an Excel file. Mentor-related documents work the same way: a coordinator uploading an applicant's resume files it to the mentor's own folder.</w:t>
       </w:r>
     </w:p>
     <w:p>
@@ -440,10 +784,14 @@
       <w:r>
         <w:rPr>
           <w:rFonts w:ascii="Calibri" w:cs="Calibri" w:eastAsia="Calibri" w:hAnsi="Calibri"/>
-          <w:sz w:val="22"/>
-          <w:szCs w:val="22"/>
-        </w:rPr>
-        <w:t xml:space="preserve">Viewing in the application. Anyone opening that mentor's record sees the document list immediately. Clicking View opens the document right inside the application. After the first view, a local copy is kept, so re-opening is instant — no waiting, no browser, no leaving the review screen.</w:t>
+          <w:b/>
+          <w:sz w:val="22"/>
+          <w:szCs w:val="22"/>
+        </w:rPr>
+        <w:t>Viewing in the application.</w:t>
+      </w:r>
+      <w:r>
+        <w:t xml:space="preserve"> Anyone opening that engagement sees its document list immediately — only that engagement's documents, with no need to sift through the client's other engagements. Clicking View opens the document right inside the application: PDFs and images directly, Word / Excel / PowerPoint files as a PDF rendering produced on demand. After the first view the browser keeps a private copy, so re-opening is instant. A separate Download action always delivers the original file itself — the exact bytes that were uploaded, formulas and all — which the person's own computer opens in Excel, Word, or whatever it has installed.</w:t>
       </w:r>
     </w:p>
     <w:p>
@@ -458,10 +806,14 @@
       <w:r>
         <w:rPr>
           <w:rFonts w:ascii="Calibri" w:cs="Calibri" w:eastAsia="Calibri" w:hAnsi="Calibri"/>
-          <w:sz w:val="22"/>
-          <w:szCs w:val="22"/>
-        </w:rPr>
-        <w:t xml:space="preserve">Viewing from the CRM. The mentor's CRM record carries a single permanent link to their document folder. One click opens the folder in the browser; because staff are already signed into Google Workspace, there is no second login. The link never goes stale, no matter how many documents are added or removed later.</w:t>
+          <w:b/>
+          <w:sz w:val="22"/>
+          <w:szCs w:val="22"/>
+        </w:rPr>
+        <w:t>Viewing from the CRM.</w:t>
+      </w:r>
+      <w:r>
+        <w:t xml:space="preserve"> The engagement's CRM record carries a single permanent link to that engagement's document folder. For the people who hold access to that folder (Section 1.2), one click opens it in the browser under their existing Google Workspace sign-in — no second login. The link never goes stale, and for anyone else it simply refuses: Google answers "You need access."</w:t>
       </w:r>
     </w:p>
     <w:p>
@@ -476,10 +828,14 @@
       <w:r>
         <w:rPr>
           <w:rFonts w:ascii="Calibri" w:cs="Calibri" w:eastAsia="Calibri" w:hAnsi="Calibri"/>
-          <w:sz w:val="22"/>
-          <w:szCs w:val="22"/>
-        </w:rPr>
-        <w:t xml:space="preserve">Working directly in Drive. Staff who prefer Drive can browse the folders by mentor name, preview files, add comments, or share a document — all the normal Drive capabilities remain available.</w:t>
+          <w:b/>
+          <w:sz w:val="22"/>
+          <w:szCs w:val="22"/>
+        </w:rPr>
+        <w:t>Working in Google Drive.</w:t>
+      </w:r>
+      <w:r>
+        <w:t xml:space="preserve"> Nobody browses the document drive itself — no one can (Section 1.2). What a mentor sees in their own Google Drive is precisely the engagement folders they have been granted, listed under "Shared with me": they can open every document there, download, and add comments — and nothing more. No other client, no other engagement, no other mentor's documents are visible, searchable, or reachable from there.</w:t>
       </w:r>
     </w:p>
     <w:p>
@@ -514,7 +870,7 @@
           <w:sz w:val="25"/>
           <w:szCs w:val="25"/>
         </w:rPr>
-        <w:t xml:space="preserve">1.2 Who Sees What</w:t>
+        <w:t>1.2 Who Sees What — The Access Model, Precisely</w:t>
       </w:r>
     </w:p>
     <w:p>
@@ -527,7 +883,263 @@
           <w:sz w:val="22"/>
           <w:szCs w:val="22"/>
         </w:rPr>
-        <w:t xml:space="preserve">Access rides on Google Workspace. Membership in the shared drive determines who can see and manage documents, using the same accounts and groups CBM already administers. Every access is attributable to a named person in Google's audit logs — there is no shared system account whose activity is anonymous.</w:t>
+        <w:t>These documents include highly confidential material, so access is deliberately narrow, decided in exactly one place, and enforced twice. The CRM's permission model is the single source of truth for who may work with which record; the application enforces it on every list, view, and download; and Google Drive is configured so nothing is visible there beyond what the application has explicitly granted. The rules, precisely:</w:t>
+      </w:r>
+    </w:p>
+    <w:p>
+      <w:pPr>
+        <w:pStyle w:val="ListParagraph"/>
+        <w:numPr>
+          <w:ilvl w:val="0"/>
+          <w:numId w:val="2"/>
+        </w:numPr>
+        <w:spacing w:after="90"/>
+      </w:pPr>
+      <w:r>
+        <w:rPr>
+          <w:b/>
+        </w:rPr>
+        <w:t>No person is a member of the document drive.</w:t>
+      </w:r>
+      <w:r>
+        <w:t xml:space="preserve"> The "CBM Documents" shared drive has exactly one member: the application's own service identity (a machine credential that exists only in the server's configuration). Drive membership is what would let someone browse everything, so no one has it — including staff and administrators. Google Workspace administrators retain emergency access through the admin console; that is a logged administrative act, not a day-to-day capability.</w:t>
+      </w:r>
+    </w:p>
+    <w:p>
+      <w:pPr>
+        <w:pStyle w:val="ListParagraph"/>
+        <w:numPr>
+          <w:ilvl w:val="0"/>
+          <w:numId w:val="2"/>
+        </w:numPr>
+        <w:spacing w:after="90"/>
+      </w:pPr>
+      <w:r>
+        <w:rPr>
+          <w:b/>
+        </w:rPr>
+        <w:t>The application is the sole gate.</w:t>
+      </w:r>
+      <w:r>
+        <w:t xml:space="preserve"> Every upload, view, and download runs through the application, which first verifies — against the CRM — that the signed-in person is entitled to the record the document belongs to. A mentor can reach exactly the documents of their own engagements and nothing else.</w:t>
+      </w:r>
+    </w:p>
+    <w:p>
+      <w:pPr>
+        <w:pStyle w:val="ListParagraph"/>
+        <w:numPr>
+          <w:ilvl w:val="0"/>
+          <w:numId w:val="2"/>
+        </w:numPr>
+        <w:spacing w:after="90"/>
+      </w:pPr>
+      <w:r>
+        <w:rPr>
+          <w:b/>
+        </w:rPr>
+        <w:t>Drive access is granted folder-by-folder, person-by-person.</w:t>
+      </w:r>
+      <w:r>
+        <w:t xml:space="preserve"> When someone becomes entitled to a record — a mentor is assigned an engagement, a co-mentor is added, a partner or sponsor manager is named — the application grants that specific person access to that record's folder. In their own Google Drive the folder appears under "Shared with me"; the drive around it does not exist for them. Google refuses any attempt to navigate upward, and Drive search returns only what they hold.</w:t>
+      </w:r>
+    </w:p>
+    <w:p>
+      <w:pPr>
+        <w:pStyle w:val="ListParagraph"/>
+        <w:numPr>
+          <w:ilvl w:val="0"/>
+          <w:numId w:val="2"/>
+        </w:numPr>
+        <w:spacing w:after="90"/>
+      </w:pPr>
+      <w:r>
+        <w:rPr>
+          <w:b/>
+        </w:rPr>
+        <w:t>Granted access means read and remark — never write.</w:t>
+      </w:r>
+      <w:r>
+        <w:t xml:space="preserve"> Grants are at Google's Commenter level: open, download, and add comments or suggestions. A grant-holder cannot create files in the folder, cannot edit, rename, move, or delete anything, and cannot share the folder onward. Every document enters the system only through the application, where it is validated, classified, and indexed — enforced by the permission level itself, not by asking nicely.</w:t>
+      </w:r>
+    </w:p>
+    <w:p>
+      <w:pPr>
+        <w:pStyle w:val="ListParagraph"/>
+        <w:numPr>
+          <w:ilvl w:val="0"/>
+          <w:numId w:val="2"/>
+        </w:numPr>
+        <w:spacing w:after="90"/>
+      </w:pPr>
+      <w:r>
+        <w:rPr>
+          <w:b/>
+        </w:rPr>
+        <w:t>Mentor personnel documents are application-only.</w:t>
+      </w:r>
+      <w:r>
+        <w:t xml:space="preserve"> The folders holding documents about a mentor — resumes, signed agreements — carry no Drive grants for anyone, the mentor included. They are reachable exclusively through the application's Mentor Administration screen, which the CRM restricts to the Mentor Administration Team.</w:t>
+      </w:r>
+    </w:p>
+    <w:p>
+      <w:pPr>
+        <w:pStyle w:val="ListParagraph"/>
+        <w:numPr>
+          <w:ilvl w:val="0"/>
+          <w:numId w:val="2"/>
+        </w:numPr>
+        <w:spacing w:after="90"/>
+      </w:pPr>
+      <w:r>
+        <w:rPr>
+          <w:b/>
+        </w:rPr>
+        <w:t>Access ends when the entitlement ends.</w:t>
+      </w:r>
+      <w:r>
+        <w:t xml:space="preserve"> Reassigning an engagement, removing a co-mentor, or offboarding a mentor revokes the matching grants as part of the same action. As a backstop, every night the application reconciles all Drive grants against the CRM's current assignments and removes anything that no longer matches — a missed revocation cannot outlive the day. Suspending a departed person's Google account ends their access instantly and independently.</w:t>
+      </w:r>
+    </w:p>
+    <w:p>
+      <w:pPr>
+        <w:pStyle w:val="ListParagraph"/>
+        <w:numPr>
+          <w:ilvl w:val="0"/>
+          <w:numId w:val="2"/>
+        </w:numPr>
+        <w:spacing w:after="90"/>
+      </w:pPr>
+      <w:r>
+        <w:rPr>
+          <w:b/>
+        </w:rPr>
+        <w:t>Everything is attributable to a person.</w:t>
+      </w:r>
+      <w:r>
+        <w:t xml:space="preserve"> The application's index records who uploaded every document. When a grant-holder opens or comments on a file in Drive, Google's audit log attributes it to them personally. Operations the application performs on someone's behalf are written to the application's own audit records under that person's name.</w:t>
+      </w:r>
+    </w:p>
+    <w:p>
+      <w:pPr>
+        <w:pStyle w:val="Heading2"/>
+        <w:spacing w:after="140" w:before="220"/>
+      </w:pPr>
+      <w:r>
+        <w:t>1.3 Anticipated Questions</w:t>
+      </w:r>
+    </w:p>
+    <w:p>
+      <w:pPr>
+        <w:pStyle w:val="ListParagraph"/>
+        <w:numPr>
+          <w:ilvl w:val="0"/>
+          <w:numId w:val="2"/>
+        </w:numPr>
+        <w:spacing w:after="90"/>
+      </w:pPr>
+      <w:r>
+        <w:rPr>
+          <w:b/>
+        </w:rPr>
+        <w:t>Can a mentor see another mentor's clients or documents?</w:t>
+      </w:r>
+      <w:r>
+        <w:t xml:space="preserve"> No. The application shows them only records the CRM says are theirs, and their Drive grants cover only those same engagement folders. There is no path — browsing, searching, or URL-guessing — to anything else.</w:t>
+      </w:r>
+    </w:p>
+    <w:p>
+      <w:pPr>
+        <w:pStyle w:val="ListParagraph"/>
+        <w:numPr>
+          <w:ilvl w:val="0"/>
+          <w:numId w:val="2"/>
+        </w:numPr>
+        <w:spacing w:after="90"/>
+      </w:pPr>
+      <w:r>
+        <w:rPr>
+          <w:b/>
+        </w:rPr>
+        <w:t>Can a mentor see their own personnel file (resume, agreement)?</w:t>
+      </w:r>
+      <w:r>
+        <w:t xml:space="preserve"> Not through Drive — mentor folders carry no grants. In the application, those documents are visible only to the Mentor Administration Team.</w:t>
+      </w:r>
+    </w:p>
+    <w:p>
+      <w:pPr>
+        <w:pStyle w:val="ListParagraph"/>
+        <w:numPr>
+          <w:ilvl w:val="0"/>
+          <w:numId w:val="2"/>
+        </w:numPr>
+        <w:spacing w:after="90"/>
+      </w:pPr>
+      <w:r>
+        <w:rPr>
+          <w:b/>
+        </w:rPr>
+        <w:t>Could someone find the drive by poking around Google Drive?</w:t>
+      </w:r>
+      <w:r>
+        <w:t xml:space="preserve"> No. A shared drive is invisible to non-members; it does not appear in anyone's sidebar or search results. A leaked link produces Google's "You need access" page.</w:t>
+      </w:r>
+    </w:p>
+    <w:p>
+      <w:pPr>
+        <w:pStyle w:val="ListParagraph"/>
+        <w:numPr>
+          <w:ilvl w:val="0"/>
+          <w:numId w:val="2"/>
+        </w:numPr>
+        <w:spacing w:after="90"/>
+      </w:pPr>
+      <w:r>
+        <w:rPr>
+          <w:b/>
+        </w:rPr>
+        <w:t>Can a grant-holder add, change, or delete files from Drive?</w:t>
+      </w:r>
+      <w:r>
+        <w:t xml:space="preserve"> No. Commenter access cannot create, modify, move, or delete anything, and cannot re-share. Additions happen only through the application, which records who, what, and when.</w:t>
+      </w:r>
+    </w:p>
+    <w:p>
+      <w:pPr>
+        <w:pStyle w:val="ListParagraph"/>
+        <w:numPr>
+          <w:ilvl w:val="0"/>
+          <w:numId w:val="2"/>
+        </w:numPr>
+        <w:spacing w:after="90"/>
+      </w:pPr>
+      <w:r>
+        <w:rPr>
+          <w:b/>
+        </w:rPr>
+        <w:t>What happens when someone leaves CBM?</w:t>
+      </w:r>
+      <w:r>
+        <w:t xml:space="preserve"> Offboarding in the application revokes their grants; the nightly reconciliation catches anything missed; and suspending their Workspace account severs all Google access immediately. Three independent locks.</w:t>
+      </w:r>
+    </w:p>
+    <w:p>
+      <w:pPr>
+        <w:pStyle w:val="ListParagraph"/>
+        <w:numPr>
+          <w:ilvl w:val="0"/>
+          <w:numId w:val="2"/>
+        </w:numPr>
+        <w:spacing w:after="90"/>
+      </w:pPr>
+      <w:r>
+        <w:rPr>
+          <w:b/>
+        </w:rPr>
+        <w:t>Who can see everything?</w:t>
+      </w:r>
+      <w:r>
+        <w:t xml:space="preserve"> No individual account can. The application's service identity can — it is a machine credential, held only in the server's encrypted configuration, and every action it takes on a person's behalf is logged under that person's name. Workspace administrators can reach the drive through the admin console, which Google logs as an administrative action.</w:t>
       </w:r>
     </w:p>
     <w:p>
@@ -596,10 +1208,14 @@
       <w:r>
         <w:rPr>
           <w:rFonts w:ascii="Calibri" w:cs="Calibri" w:eastAsia="Calibri" w:hAnsi="Calibri"/>
-          <w:sz w:val="22"/>
-          <w:szCs w:val="22"/>
-        </w:rPr>
-        <w:t xml:space="preserve">Sign-in staff already have. CRM links open with the user's existing Workspace session. No new passwords, no unfamiliar login prompts — the single biggest adoption risk of a self-hosted alternative simply does not exist here.</w:t>
+          <w:b/>
+          <w:sz w:val="22"/>
+          <w:szCs w:val="22"/>
+        </w:rPr>
+        <w:t>Sign-in staff already have.</w:t>
+      </w:r>
+      <w:r>
+        <w:t xml:space="preserve"> The application uses its own CBM sign-in; Drive folder links open under the person's existing Workspace session for exactly the folders they hold. No new passwords, no unfamiliar login prompts.</w:t>
       </w:r>
     </w:p>
     <w:p>
@@ -650,10 +1266,14 @@
       <w:r>
         <w:rPr>
           <w:rFonts w:ascii="Calibri" w:cs="Calibri" w:eastAsia="Calibri" w:hAnsi="Calibri"/>
-          <w:sz w:val="22"/>
-          <w:szCs w:val="22"/>
-        </w:rPr>
-        <w:t xml:space="preserve">Accountable by default. Google's audit logs record who viewed, added, or changed each file, attributed to real individuals — relevant for the Mentor Administration Team's permissions and confidentiality obligations.</w:t>
+          <w:b/>
+          <w:sz w:val="22"/>
+          <w:szCs w:val="22"/>
+        </w:rPr>
+        <w:t>Accountable by default.</w:t>
+      </w:r>
+      <w:r>
+        <w:t xml:space="preserve"> The application records the person behind every upload and download; Google's audit logs attribute every Drive-side view and comment to the named individual who made it. There is no anonymous access path: the only broad credential is the application's own, and it acts solely on instructions the application has already tied to a signed-in person.</w:t>
       </w:r>
     </w:p>
     <w:p>
@@ -740,10 +1360,14 @@
       <w:r>
         <w:rPr>
           <w:rFonts w:ascii="Calibri" w:cs="Calibri" w:eastAsia="Calibri" w:hAnsi="Calibri"/>
-          <w:sz w:val="22"/>
-          <w:szCs w:val="22"/>
-        </w:rPr>
-        <w:t xml:space="preserve">Uploads should flow through the application. The index stays complete only when documents are added via the application. A file dropped straight into a Drive folder is visible in Drive but invisible to the application until a reconciliation step catches it. A "link existing Drive file" capability is planned to soften this.</w:t>
+          <w:b/>
+          <w:sz w:val="22"/>
+          <w:szCs w:val="22"/>
+        </w:rPr>
+        <w:t>Uploads flow through the application — now enforced.</w:t>
+      </w:r>
+      <w:r>
+        <w:t xml:space="preserve"> The index stays complete because it cannot be bypassed: no one holds Drive permission to drop a file into a folder by hand. The residual case is an administrator deliberately using the admin console; a "link existing Drive file" capability and a reconciliation report remain planned for that path.</w:t>
       </w:r>
     </w:p>
     <w:p>
@@ -758,10 +1382,14 @@
       <w:r>
         <w:rPr>
           <w:rFonts w:ascii="Calibri" w:cs="Calibri" w:eastAsia="Calibri" w:hAnsi="Calibri"/>
-          <w:sz w:val="22"/>
-          <w:szCs w:val="22"/>
-        </w:rPr>
-        <w:t xml:space="preserve">One-time setup per user. Each staff member authorizes the application against their Google account once. It is a single browser consent screen, but it is a step that must be communicated and supported.</w:t>
+          <w:b/>
+          <w:sz w:val="22"/>
+          <w:szCs w:val="22"/>
+        </w:rPr>
+        <w:t>The application maintains a permission ledger.</w:t>
+      </w:r>
+      <w:r>
+        <w:t xml:space="preserve"> Folder grants must track CRM assignments forever — every reassignment or departure must revoke access. The design accepts this honestly and automates it twice over: grants and revocations ride the same application actions that change assignments, and a nightly reconciliation re-derives every grant from the CRM and corrects any drift. The failure mode is bounded: at worst, a Drive folder stays readable to a recently-unassigned mentor until the next nightly sweep.</w:t>
       </w:r>
     </w:p>
     <w:p>
@@ -776,10 +1404,14 @@
       <w:r>
         <w:rPr>
           <w:rFonts w:ascii="Calibri" w:cs="Calibri" w:eastAsia="Calibri" w:hAnsi="Calibri"/>
-          <w:sz w:val="22"/>
-          <w:szCs w:val="22"/>
-        </w:rPr>
-        <w:t xml:space="preserve">The "Save as Google Sheets" wrinkle. If someone opens an uploaded Excel file in Drive and converts it to a Google Sheet, Drive creates a second copy; the application still points at the original. Nothing is lost, but duplicates can accumulate. Mitigation is a simple staff convention (edit Office files in place) plus a planned duplicate report.</w:t>
+          <w:b/>
+          <w:sz w:val="22"/>
+          <w:szCs w:val="22"/>
+        </w:rPr>
+        <w:t>The "Save as Google Sheets" wrinkle — largely closed.</w:t>
+      </w:r>
+      <w:r>
+        <w:t xml:space="preserve"> Converting an uploaded Excel file into a Google Sheet would create a confusing second copy. Since no one can create files in the drive, this can no longer happen there. A grant-holder can still copy a document into their personal Drive — read access of any kind permits copying, as it permits downloading — which is a confidentiality-policy matter (what people may retain), not a system-integrity one.</w:t>
       </w:r>
     </w:p>
     <w:p>
@@ -812,10 +1444,14 @@
       <w:r>
         <w:rPr>
           <w:rFonts w:ascii="Calibri" w:cs="Calibri" w:eastAsia="Calibri" w:hAnsi="Calibri"/>
-          <w:sz w:val="22"/>
-          <w:szCs w:val="22"/>
-        </w:rPr>
-        <w:t xml:space="preserve">Google-native files view as snapshots. Documents created as Google Docs or Sheets are shown in-app as PDF renditions; editing them happens in Drive. In practice most managed documents (resumes, signed agreements) are static, so this is rarely felt.</w:t>
+          <w:b/>
+          <w:sz w:val="22"/>
+          <w:szCs w:val="22"/>
+        </w:rPr>
+        <w:t>Office and Google-native files view as snapshots.</w:t>
+      </w:r>
+      <w:r>
+        <w:t xml:space="preserve"> Word, Excel, PowerPoint, and Google-format documents are shown in-app as PDF renditions; the Download action supplies the original for real editing, and grant-holders can comment on the originals in Drive. The first view of an Office file waits a few seconds for the rendition; subsequent views are instant.</w:t>
       </w:r>
     </w:p>
     <w:p>
@@ -863,7 +1499,254 @@
           <w:sz w:val="22"/>
           <w:szCs w:val="22"/>
         </w:rPr>
-        <w:t xml:space="preserve">Some stakeholders have asked that documents be stored in a folder for each mentor. The design does exactly that. Every mentor gets a folder in the shared drive, named in plain language — for example:</w:t>
+        <w:t xml:space="preserve">Some stakeholders have asked that documents be stored in a folder for each mentor. The design does exactly that — and organizes client work the same way, one folder per client with a subfolder for each engagement inside it. Here is the complete structure, illustrated with example content:</w:t>
+      </w:r>
+    </w:p>
+    <w:p>
+      <w:pPr>
+        <w:spacing w:after="20"/>
+      </w:pPr>
+      <w:r>
+        <w:rPr>
+          <w:rFonts w:ascii="Consolas" w:cs="Consolas" w:eastAsia="Consolas" w:hAnsi="Consolas"/>
+          <w:sz w:val="18"/>
+          <w:szCs w:val="18"/>
+        </w:rPr>
+        <w:t xml:space="preserve">CBM Documents                                (the shared drive)</w:t>
+      </w:r>
+    </w:p>
+    <w:p>
+      <w:pPr>
+        <w:spacing w:after="20"/>
+      </w:pPr>
+      <w:r>
+        <w:rPr>
+          <w:rFonts w:ascii="Consolas" w:cs="Consolas" w:eastAsia="Consolas" w:hAnsi="Consolas"/>
+          <w:sz w:val="18"/>
+          <w:szCs w:val="18"/>
+        </w:rPr>
+        <w:t xml:space="preserve">│</w:t>
+      </w:r>
+    </w:p>
+    <w:p>
+      <w:pPr>
+        <w:spacing w:after="20"/>
+      </w:pPr>
+      <w:r>
+        <w:rPr>
+          <w:rFonts w:ascii="Consolas" w:cs="Consolas" w:eastAsia="Consolas" w:hAnsi="Consolas"/>
+          <w:sz w:val="18"/>
+          <w:szCs w:val="18"/>
+        </w:rPr>
+        <w:t xml:space="preserve">├── Mentors</w:t>
+      </w:r>
+    </w:p>
+    <w:p>
+      <w:pPr>
+        <w:spacing w:after="20"/>
+      </w:pPr>
+      <w:r>
+        <w:rPr>
+          <w:rFonts w:ascii="Consolas" w:cs="Consolas" w:eastAsia="Consolas" w:hAnsi="Consolas"/>
+          <w:sz w:val="18"/>
+          <w:szCs w:val="18"/>
+        </w:rPr>
+        <w:t xml:space="preserve">│   ├── Jane Smith</w:t>
+      </w:r>
+    </w:p>
+    <w:p>
+      <w:pPr>
+        <w:spacing w:after="20"/>
+      </w:pPr>
+      <w:r>
+        <w:rPr>
+          <w:rFonts w:ascii="Consolas" w:cs="Consolas" w:eastAsia="Consolas" w:hAnsi="Consolas"/>
+          <w:sz w:val="18"/>
+          <w:szCs w:val="18"/>
+        </w:rPr>
+        <w:t xml:space="preserve">│   │   ├── Jane Smith Resume.docx</w:t>
+      </w:r>
+    </w:p>
+    <w:p>
+      <w:pPr>
+        <w:spacing w:after="20"/>
+      </w:pPr>
+      <w:r>
+        <w:rPr>
+          <w:rFonts w:ascii="Consolas" w:cs="Consolas" w:eastAsia="Consolas" w:hAnsi="Consolas"/>
+          <w:sz w:val="18"/>
+          <w:szCs w:val="18"/>
+        </w:rPr>
+        <w:t xml:space="preserve">│   │   └── Signed Mentor Agreement.pdf</w:t>
+      </w:r>
+    </w:p>
+    <w:p>
+      <w:pPr>
+        <w:spacing w:after="20"/>
+      </w:pPr>
+      <w:r>
+        <w:rPr>
+          <w:rFonts w:ascii="Consolas" w:cs="Consolas" w:eastAsia="Consolas" w:hAnsi="Consolas"/>
+          <w:sz w:val="18"/>
+          <w:szCs w:val="18"/>
+        </w:rPr>
+        <w:t xml:space="preserve">│   └── Bob Jones</w:t>
+      </w:r>
+    </w:p>
+    <w:p>
+      <w:pPr>
+        <w:spacing w:after="20"/>
+      </w:pPr>
+      <w:r>
+        <w:rPr>
+          <w:rFonts w:ascii="Consolas" w:cs="Consolas" w:eastAsia="Consolas" w:hAnsi="Consolas"/>
+          <w:sz w:val="18"/>
+          <w:szCs w:val="18"/>
+        </w:rPr>
+        <w:t xml:space="preserve">│       └── Bob Jones Resume.pdf</w:t>
+      </w:r>
+    </w:p>
+    <w:p>
+      <w:pPr>
+        <w:spacing w:after="20"/>
+      </w:pPr>
+      <w:r>
+        <w:rPr>
+          <w:rFonts w:ascii="Consolas" w:cs="Consolas" w:eastAsia="Consolas" w:hAnsi="Consolas"/>
+          <w:sz w:val="18"/>
+          <w:szCs w:val="18"/>
+        </w:rPr>
+        <w:t xml:space="preserve">│</w:t>
+      </w:r>
+    </w:p>
+    <w:p>
+      <w:pPr>
+        <w:spacing w:after="20"/>
+      </w:pPr>
+      <w:r>
+        <w:rPr>
+          <w:rFonts w:ascii="Consolas" w:cs="Consolas" w:eastAsia="Consolas" w:hAnsi="Consolas"/>
+          <w:sz w:val="18"/>
+          <w:szCs w:val="18"/>
+        </w:rPr>
+        <w:t xml:space="preserve">└── Clients</w:t>
+      </w:r>
+    </w:p>
+    <w:p>
+      <w:pPr>
+        <w:spacing w:after="20"/>
+      </w:pPr>
+      <w:r>
+        <w:rPr>
+          <w:rFonts w:ascii="Consolas" w:cs="Consolas" w:eastAsia="Consolas" w:hAnsi="Consolas"/>
+          <w:sz w:val="18"/>
+          <w:szCs w:val="18"/>
+        </w:rPr>
+        <w:t xml:space="preserve">    ├── Acme Robotics</w:t>
+      </w:r>
+    </w:p>
+    <w:p>
+      <w:pPr>
+        <w:spacing w:after="20"/>
+      </w:pPr>
+      <w:r>
+        <w:rPr>
+          <w:rFonts w:ascii="Consolas" w:cs="Consolas" w:eastAsia="Consolas" w:hAnsi="Consolas"/>
+          <w:sz w:val="18"/>
+          <w:szCs w:val="18"/>
+        </w:rPr>
+        <w:t xml:space="preserve">    │   ├── Jane Smith – 2026          ← one engagement</w:t>
+      </w:r>
+    </w:p>
+    <w:p>
+      <w:pPr>
+        <w:spacing w:after="20"/>
+      </w:pPr>
+      <w:r>
+        <w:rPr>
+          <w:rFonts w:ascii="Consolas" w:cs="Consolas" w:eastAsia="Consolas" w:hAnsi="Consolas"/>
+          <w:sz w:val="18"/>
+          <w:szCs w:val="18"/>
+        </w:rPr>
+        <w:t xml:space="preserve">    │   │   ├── Pitch Deck v3.pptx</w:t>
+      </w:r>
+    </w:p>
+    <w:p>
+      <w:pPr>
+        <w:spacing w:after="20"/>
+      </w:pPr>
+      <w:r>
+        <w:rPr>
+          <w:rFonts w:ascii="Consolas" w:cs="Consolas" w:eastAsia="Consolas" w:hAnsi="Consolas"/>
+          <w:sz w:val="18"/>
+          <w:szCs w:val="18"/>
+        </w:rPr>
+        <w:t xml:space="preserve">    │   │   └── Meeting Notes 03-12.docx</w:t>
+      </w:r>
+    </w:p>
+    <w:p>
+      <w:pPr>
+        <w:spacing w:after="20"/>
+      </w:pPr>
+      <w:r>
+        <w:rPr>
+          <w:rFonts w:ascii="Consolas" w:cs="Consolas" w:eastAsia="Consolas" w:hAnsi="Consolas"/>
+          <w:sz w:val="18"/>
+          <w:szCs w:val="18"/>
+        </w:rPr>
+        <w:t xml:space="preserve">    │   └── Bob Jones – 2024           ← an earlier engagement</w:t>
+      </w:r>
+    </w:p>
+    <w:p>
+      <w:pPr>
+        <w:spacing w:after="20"/>
+      </w:pPr>
+      <w:r>
+        <w:rPr>
+          <w:rFonts w:ascii="Consolas" w:cs="Consolas" w:eastAsia="Consolas" w:hAnsi="Consolas"/>
+          <w:sz w:val="18"/>
+          <w:szCs w:val="18"/>
+        </w:rPr>
+        <w:t xml:space="preserve">    │       └── Initial Assessment.pdf</w:t>
+      </w:r>
+    </w:p>
+    <w:p>
+      <w:pPr>
+        <w:spacing w:after="20"/>
+      </w:pPr>
+      <w:r>
+        <w:rPr>
+          <w:rFonts w:ascii="Consolas" w:cs="Consolas" w:eastAsia="Consolas" w:hAnsi="Consolas"/>
+          <w:sz w:val="18"/>
+          <w:szCs w:val="18"/>
+        </w:rPr>
+        <w:t xml:space="preserve">    └── Z Company</w:t>
+      </w:r>
+    </w:p>
+    <w:p>
+      <w:pPr>
+        <w:spacing w:after="20"/>
+      </w:pPr>
+      <w:r>
+        <w:rPr>
+          <w:rFonts w:ascii="Consolas" w:cs="Consolas" w:eastAsia="Consolas" w:hAnsi="Consolas"/>
+          <w:sz w:val="18"/>
+          <w:szCs w:val="18"/>
+        </w:rPr>
+        <w:t xml:space="preserve">        └── Jane Smith – 2026</w:t>
+      </w:r>
+    </w:p>
+    <w:p>
+      <w:pPr>
+        <w:spacing w:after="160"/>
+      </w:pPr>
+      <w:r>
+        <w:rPr>
+          <w:rFonts w:ascii="Consolas" w:cs="Consolas" w:eastAsia="Consolas" w:hAnsi="Consolas"/>
+          <w:sz w:val="18"/>
+          <w:szCs w:val="18"/>
+        </w:rPr>
+        <w:t xml:space="preserve">            └── Business Plan Draft.xlsx</w:t>
       </w:r>
     </w:p>
     <w:p>
@@ -873,12 +1756,10 @@
       <w:r>
         <w:rPr>
           <w:rFonts w:ascii="Calibri" w:cs="Calibri" w:eastAsia="Calibri" w:hAnsi="Calibri"/>
-          <w:i/>
-          <w:iCs/>
-          <w:sz w:val="22"/>
-          <w:szCs w:val="22"/>
-        </w:rPr>
-        <w:t xml:space="preserve">/CBM Documents/Contact/Jane Smith (record ID)/</w:t>
+          <w:sz w:val="22"/>
+          <w:szCs w:val="22"/>
+        </w:rPr>
+        <w:t xml:space="preserve">Engagement folders take their names from the engagement record's Name field, so what staff see in Drive matches what they see in the application. (Each folder name also carries a short record identifier, omitted above for readability, which lets the software keep track of folders even if someone renames them.)</w:t>
       </w:r>
     </w:p>
     <w:p>
@@ -891,7 +1772,7 @@
           <w:sz w:val="22"/>
           <w:szCs w:val="22"/>
         </w:rPr>
-        <w:t xml:space="preserve">Anyone can open Drive and browse straight to Jane's documents. The real question is therefore not whether mentor folders exist — they do — but what the organization treats as the authoritative record: a database index maintained by the application, or the folder structure alone, maintained by hand. The design chooses the index, with folders as the human-friendly view. The alternative — folders as the only system, with staff filing documents manually — looks simpler and is genuinely worse. Here is why.</w:t>
+        <w:t xml:space="preserve">Anyone can open Drive and browse straight to Jane's documents, or to everything from a specific engagement with a client. The real question is therefore not whether these folders exist — they do — but what the organization treats as the authoritative record: a database index maintained by the application, or the folder structure alone, maintained by hand. The design chooses the index, with folders as the human-friendly view. The alternative — folders as the only system, with staff filing documents manually — looks simpler and is genuinely worse. Here is why.</w:t>
       </w:r>
     </w:p>
     <w:p>
@@ -1095,7 +1976,7 @@
           <w:sz w:val="22"/>
           <w:szCs w:val="22"/>
         </w:rPr>
-        <w:t xml:space="preserve">The document management function stores CBM's documents in CBM's existing Google Workspace, organized in per-mentor folders that staff can browse naturally, indexed by the application so that viewing is instant, CRM links never break, and every document has a known type, owner, and status. Its costs are honest and bounded: a dependency CBM already carries, a one-time authorization step per user, and engineering effort paid once. Its alternative — folders alone — offers familiarity up front and pays for it indefinitely in broken links, lost context, and manual cleanup. The recommendation stands: per-mentor folders as the human view, the application index as the system of record.</w:t>
+        <w:t xml:space="preserve">The document management function stores CBM's documents in CBM's existing Google Workspace, organized the way the work is organized — mentor folders for mentor documents, and an engagement subfolder inside each client folder for client work, so mentors see exactly their engagement's documents while a client's full history stays browsable in one place. The application indexes everything, so viewing is instant, CRM links never break, and every document has a known type, owner, and status. Its costs are honest and bounded: a dependency CBM already carries, a one-time authorization step per user, and engineering effort paid once. Its alternative — folders alone — offers familiarity up front and pays for it indefinitely in broken links, lost context, and manual cleanup. The recommendation stands: folders as the human view, the application index as the system of record.</w:t>
       </w:r>
     </w:p>
     <w:sectPr>

</xml_diff>

<commit_message>
docs(docmgmt): access-model amendment (PRD v1.5) + Phase 3 activation record
Doug's ruling 2026-07-17: the two designated system administrators
(doug.bower@, allen.ingram@) RETAIN shared-drive membership for
maintenance and review — 'no person is a member' now carries that single
named exception; espo@cbmentors.org removed (member list = SA + the two
admins). PRD + Executive Summary bumped to v1.5 amending D-08, §3.1/§3.4,
NFR-03 and the exec summary's absolute claims; prds/ copy synced.

Activation record (2026-07-18): GDRIVE_IDENTITY=service on web +
GDRIVE_* on worker applied to BOTH environments via doctl; both healthy.
DOC-09 verified live on prod — the worker's startup reconciliation ran as
the service account and issued 2 engagement-folder Commenter grants, zero
errors. GDRIVE-DOCS-SETUP.md Task 6 steps 1-2 marked DONE; remaining =
the documentsFolderUrl CRM field build + the hand-driven verify items.

Co-Authored-By: Claude Fable 5 <noreply@anthropic.com>
</commit_message>
<xml_diff>
--- a/prds/CBM-DocMgmt-Executive-Summary.docx
+++ b/prds/CBM-DocMgmt-Executive-Summary.docx
@@ -62,7 +62,7 @@
           <w:sz w:val="22"/>
           <w:szCs w:val="22"/>
         </w:rPr>
-        <w:t>Version: 1.4</w:t>
+        <w:t>Version: 1.5</w:t>
       </w:r>
     </w:p>
     <w:p>
@@ -76,7 +76,7 @@
           <w:sz w:val="22"/>
           <w:szCs w:val="22"/>
         </w:rPr>
-        <w:t>Last Updated: 07-17-26 01:25</w:t>
+        <w:t>Last Updated: 07-18-26 00:30</w:t>
       </w:r>
     </w:p>
     <w:p>
@@ -90,7 +90,7 @@
           <w:sz w:val="22"/>
           <w:szCs w:val="22"/>
         </w:rPr>
-        <w:t>Companion to: Document Management (DOC-MGMT) — Implementation PRD, v1.4</w:t>
+        <w:t>Companion to: Document Management (DOC-MGMT) — Implementation PRD, v1.5</w:t>
       </w:r>
     </w:p>
     <w:p>
@@ -255,7 +255,7 @@
           </w:tcPr>
           <w:p>
             <w:r>
-              <w:t xml:space="preserve">1.4</w:t>
+              <w:t xml:space="preserve">1.5</w:t>
             </w:r>
           </w:p>
         </w:tc>
@@ -271,7 +271,7 @@
           </w:tcPr>
           <w:p>
             <w:r>
-              <w:t xml:space="preserve">07-17-26 01:25</w:t>
+              <w:t xml:space="preserve">07-18-26 00:30</w:t>
             </w:r>
           </w:p>
         </w:tc>
@@ -303,7 +303,7 @@
           </w:tcPr>
           <w:p>
             <w:r>
-              <w:t xml:space="preserve">Phase 3 implemented in the application (v0.76.0): the folder-grant machinery, nightly reconciliation, archive/restore, and CRM folder links described here now exist in code. No change to the access model or to any commitment in this document; the PRD v1.4 records the implementation decisions. Live activation (drive membership swap plus configuration) is the remaining step.</w:t>
+              <w:t xml:space="preserve">Access model amendment (Doug's ruling 07-17-26): two designated system administrators (Doug Bower, Allen Ingram) retain drive membership for maintenance and review — the 'no person is a member' statements in this document now carry that single, named exception. End users still have no membership and only per-folder read-and-comment grants; every document still enters through the application, with the admins' console access as the audited exception. The grant machinery is live in production as of this date.</w:t>
             </w:r>
           </w:p>
         </w:tc>
@@ -321,6 +321,72 @@
           </w:tcPr>
           <w:p>
             <w:r>
+              <w:t xml:space="preserve">1.4</w:t>
+            </w:r>
+          </w:p>
+        </w:tc>
+        <w:tc>
+          <w:tcPr>
+            <w:tcW w:type="dxa" w:w="1500"/>
+            <w:tcMar>
+              <w:top w:type="dxa" w:w="60"/>
+              <w:left w:type="dxa" w:w="100"/>
+              <w:bottom w:type="dxa" w:w="60"/>
+              <w:right w:type="dxa" w:w="100"/>
+            </w:tcMar>
+          </w:tcPr>
+          <w:p>
+            <w:r>
+              <w:t xml:space="preserve">07-17-26 01:25</w:t>
+            </w:r>
+          </w:p>
+        </w:tc>
+        <w:tc>
+          <w:tcPr>
+            <w:tcW w:type="dxa" w:w="2300"/>
+            <w:tcMar>
+              <w:top w:type="dxa" w:w="60"/>
+              <w:left w:type="dxa" w:w="100"/>
+              <w:bottom w:type="dxa" w:w="60"/>
+              <w:right w:type="dxa" w:w="100"/>
+            </w:tcMar>
+          </w:tcPr>
+          <w:p>
+            <w:r>
+              <w:t xml:space="preserve">Doug Bower (drafted with Claude)</w:t>
+            </w:r>
+          </w:p>
+        </w:tc>
+        <w:tc>
+          <w:tcPr>
+            <w:tcW w:type="dxa" w:w="4460"/>
+            <w:tcMar>
+              <w:top w:type="dxa" w:w="60"/>
+              <w:left w:type="dxa" w:w="100"/>
+              <w:bottom w:type="dxa" w:w="60"/>
+              <w:right w:type="dxa" w:w="100"/>
+            </w:tcMar>
+          </w:tcPr>
+          <w:p>
+            <w:r>
+              <w:t xml:space="preserve">Phase 3 implemented in the application (v0.76.0): the folder-grant machinery, nightly reconciliation, archive/restore, and CRM folder links described here now exist in code. No change to the access model or to any commitment in this document; the PRD v1.4 records the implementation decisions. Live activation (drive membership swap plus configuration) is the remaining step.</w:t>
+            </w:r>
+          </w:p>
+        </w:tc>
+      </w:tr>
+      <w:tr>
+        <w:tc>
+          <w:tcPr>
+            <w:tcW w:type="dxa" w:w="1100"/>
+            <w:tcMar>
+              <w:top w:type="dxa" w:w="60"/>
+              <w:left w:type="dxa" w:w="100"/>
+              <w:bottom w:type="dxa" w:w="60"/>
+              <w:right w:type="dxa" w:w="100"/>
+            </w:tcMar>
+          </w:tcPr>
+          <w:p>
+            <w:r>
               <w:t>1.3</w:t>
             </w:r>
           </w:p>
@@ -369,7 +435,7 @@
           </w:tcPr>
           <w:p>
             <w:r>
-              <w:t>Access model finalized. No person is a member of the shared drive (the application's service identity is the sole member); the application performs all document operations and is the sole gate, enforcing the CRM's permissions; Drive-side access is per-person, folder-level Commenter grants that mirror CRM assignments, with automatic revocation and a nightly reconciliation; mentor personnel folders carry no grants (app-only). Section 1.2 rewritten as the precise access model with anticipated questions (1.3); walkthrough, strengths, and trade-offs updated to match, including the as-built web viewer (browser-held copies, Download original).</w:t>
+              <w:t>Access model finalized. No person is a member of the shared drive (the application's service identity plus two designated system administrators are the only members (v1.5)); the application performs all document operations and is the sole gate, enforcing the CRM's permissions; Drive-side access is per-person, folder-level Commenter grants that mirror CRM assignments, with automatic revocation and a nightly reconciliation; mentor personnel folders carry no grants (app-only). Section 1.2 rewritten as the precise access model with anticipated questions (1.3); walkthrough, strengths, and trade-offs updated to match, including the as-built web viewer (browser-held copies, Download original).</w:t>
             </w:r>
           </w:p>
         </w:tc>
@@ -835,7 +901,7 @@
         <w:t>Working in Google Drive.</w:t>
       </w:r>
       <w:r>
-        <w:t xml:space="preserve"> Nobody browses the document drive itself — no one can (Section 1.2). What a mentor sees in their own Google Drive is precisely the engagement folders they have been granted, listed under "Shared with me": they can open every document there, download, and add comments — and nothing more. No other client, no other engagement, no other mentor's documents are visible, searchable, or reachable from there.</w:t>
+        <w:t xml:space="preserve"> Nobody browses the document drive itself — no one can, with one named exception: two designated system administrators (for maintenance and review, v1.5) (Section 1.2). What a mentor sees in their own Google Drive is precisely the engagement folders they have been granted, listed under "Shared with me": they can open every document there, download, and add comments — and nothing more. No other client, no other engagement, no other mentor's documents are visible, searchable, or reachable from there.</w:t>
       </w:r>
     </w:p>
     <w:p>
@@ -1367,7 +1433,7 @@
         <w:t>Uploads flow through the application — now enforced.</w:t>
       </w:r>
       <w:r>
-        <w:t xml:space="preserve"> The index stays complete because it cannot be bypassed: no one holds Drive permission to drop a file into a folder by hand. The residual case is an administrator deliberately using the admin console; a "link existing Drive file" capability and a reconciliation report remain planned for that path.</w:t>
+        <w:t xml:space="preserve"> The index stays complete because it cannot be bypassed: no end user holds Drive permission to drop a file into a folder by hand (the two system administrators are the audited exception, v1.5). The residual case is an administrator deliberately using the admin console; a "link existing Drive file" capability and a reconciliation report remain planned for that path.</w:t>
       </w:r>
     </w:p>
     <w:p>

</xml_diff>